<commit_message>
Enhance netcat AAT report and presentation
Co-authored-by: Aastha Sharma K M <aastha2208@users.noreply.github.com>
</commit_message>
<xml_diff>
--- a/netcat_aat_project/Secure_Data_Transmission_over_Netcat_Report.docx
+++ b/netcat_aat_project/Secure_Data_Transmission_over_Netcat_Report.docx
@@ -9,6 +9,7 @@
       <w:r>
         <w:rPr>
           <w:b/>
+          <w:color w:val="1F4E79"/>
           <w:sz w:val="32"/>
         </w:rPr>
         <w:t>ALTERNATE ASSESSMENT TOOL REPORT</w:t>
@@ -33,31 +34,13 @@
       <w:r>
         <w:rPr>
           <w:b/>
+          <w:sz w:val="22"/>
         </w:rPr>
-        <w:t xml:space="preserve">Assignment Title: </w:t>
-      </w:r>
-      <w:r>
-        <w:t>Practical Exploration of Cryptography / Security Tools</w:t>
+        <w:t>Assignment Title: Practical Exploration of Cryptography / Security Tools</w:t>
         <w:br/>
-      </w:r>
-      <w:r>
-        <w:rPr>
-          <w:b/>
-        </w:rPr>
-        <w:t xml:space="preserve">Selected Tool: </w:t>
-      </w:r>
-      <w:r>
-        <w:t>Netcat / Ncat</w:t>
+        <w:t>Selected Tool: Netcat / Ncat</w:t>
         <w:br/>
-      </w:r>
-      <w:r>
-        <w:rPr>
-          <w:b/>
-        </w:rPr>
-        <w:t xml:space="preserve">Team Members: </w:t>
-      </w:r>
-      <w:r>
-        <w:t>Tanishk, Aastha, Aditi</w:t>
+        <w:t>Team Members: Tanishk, Aastha, Aditi</w:t>
       </w:r>
     </w:p>
     <w:p>
@@ -70,10 +53,7 @@
     </w:p>
     <w:p>
       <w:r>
-        <w:rPr>
-          <w:b w:val="0"/>
-        </w:rPr>
-        <w:t>This mini project demonstrates why confidential data should not be sent using a normal plaintext network channel. Netcat is used to send data between a sender and receiver. In normal mode, the message is visible in Wireshark. Then the same message is sent using Ncat SSL, a Netcat-compatible encrypted channel. The receiver gets the data, but Wireshark cannot show the readable message. This proves confidentiality through encryption.</w:t>
+        <w:t>This mini project demonstrates confidentiality in network communication using a simple sender-receiver model. First, a secret message is transmitted using normal Netcat. Wireshark is used to capture the packets, and the message is visible in readable form. This proves that normal Netcat communication is plaintext and not suitable for confidential data. Next, the same message is transmitted using Ncat SSL, a Netcat-compatible encrypted channel. The receiver still receives the correct message, but Wireshark cannot display the original message in readable form. This proves that encryption protects confidentiality during transmission.</w:t>
       </w:r>
     </w:p>
     <w:p>
@@ -86,18 +66,33 @@
     </w:p>
     <w:p>
       <w:r>
-        <w:rPr>
-          <w:b w:val="0"/>
-        </w:rPr>
-        <w:t>Netcat is a command-line networking utility used to read from and write to network connections using TCP or UDP. It can be used for testing ports, sending messages, transferring files, and debugging simple network services.</w:t>
+        <w:t>Netcat is a command-line networking utility used to read and write data across network connections using TCP or UDP. It can create quick client-server connections, transfer files, test ports, and debug simple network services.</w:t>
       </w:r>
     </w:p>
     <w:p>
       <w:r>
-        <w:rPr>
-          <w:b w:val="0"/>
-        </w:rPr>
-        <w:t>Traditional Netcat does not encrypt data. To demonstrate an encrypted channel, this project uses Ncat with SSL. Ncat is a Netcat-compatible tool from the Nmap project and supports SSL/TLS encryption.</w:t>
+        <w:t>Traditional Netcat does not provide encryption. Therefore, this project uses Ncat with SSL for the encrypted part. Ncat is a modern Netcat-compatible tool from the Nmap project and supports SSL/TLS encryption.</w:t>
+      </w:r>
+    </w:p>
+    <w:p>
+      <w:pPr>
+        <w:pStyle w:val="Heading1"/>
+      </w:pPr>
+      <w:r>
+        <w:t>2. Problem Statement</w:t>
+      </w:r>
+    </w:p>
+    <w:p>
+      <w:r>
+        <w:t>In real networks, data packets travel through Wi-Fi, routers, and switches. If communication is not encrypted, a person with packet-capturing access may read the data. This is dangerous for passwords, private messages, login data, confidential documents, and financial information.</w:t>
+      </w:r>
+    </w:p>
+    <w:p>
+      <w:pPr>
+        <w:pStyle w:val="Heading1"/>
+      </w:pPr>
+      <w:r>
+        <w:t>3. Objectives</w:t>
       </w:r>
     </w:p>
     <w:p>
@@ -105,7 +100,7 @@
         <w:pStyle w:val="ListBullet"/>
       </w:pPr>
       <w:r>
-        <w:t>Netcat (nc): sends data normally without encryption.</w:t>
+        <w:t>Understand basic Netcat sender-receiver communication.</w:t>
       </w:r>
     </w:p>
     <w:p>
@@ -113,7 +108,7 @@
         <w:pStyle w:val="ListBullet"/>
       </w:pPr>
       <w:r>
-        <w:t>Ncat SSL: sends data through an encrypted SSL/TLS channel.</w:t>
+        <w:t>Send a secret text file through a plaintext Netcat channel.</w:t>
       </w:r>
     </w:p>
     <w:p>
@@ -121,7 +116,31 @@
         <w:pStyle w:val="ListBullet"/>
       </w:pPr>
       <w:r>
-        <w:t>Wireshark: captures packets to check whether the message is readable.</w:t>
+        <w:t>Capture plaintext traffic using Wireshark and prove that the message is readable.</w:t>
+      </w:r>
+    </w:p>
+    <w:p>
+      <w:pPr>
+        <w:pStyle w:val="ListBullet"/>
+      </w:pPr>
+      <w:r>
+        <w:t>Send the same file through an encrypted Ncat SSL channel.</w:t>
+      </w:r>
+    </w:p>
+    <w:p>
+      <w:pPr>
+        <w:pStyle w:val="ListBullet"/>
+      </w:pPr>
+      <w:r>
+        <w:t>Capture encrypted traffic and prove that the original message is not readable.</w:t>
+      </w:r>
+    </w:p>
+    <w:p>
+      <w:pPr>
+        <w:pStyle w:val="ListBullet"/>
+      </w:pPr>
+      <w:r>
+        <w:t>Relate the demonstration to confidentiality in cryptography and network security.</w:t>
       </w:r>
     </w:p>
     <w:p>
@@ -129,55 +148,180 @@
         <w:pStyle w:val="Heading1"/>
       </w:pPr>
       <w:r>
-        <w:t>2. Objective</w:t>
+        <w:t>4. Marking Scheme Alignment</w:t>
       </w:r>
     </w:p>
-    <w:p>
-      <w:pPr>
-        <w:pStyle w:val="ListBullet"/>
-      </w:pPr>
-      <w:r>
-        <w:t>Understand how Netcat sends data between two systems.</w:t>
-      </w:r>
-    </w:p>
-    <w:p>
-      <w:pPr>
-        <w:pStyle w:val="ListBullet"/>
-      </w:pPr>
-      <w:r>
-        <w:t>Show that plaintext Netcat traffic can be read using Wireshark.</w:t>
-      </w:r>
-    </w:p>
-    <w:p>
-      <w:pPr>
-        <w:pStyle w:val="ListBullet"/>
-      </w:pPr>
-      <w:r>
-        <w:t>Show encrypted data transmission using Ncat SSL.</w:t>
-      </w:r>
-    </w:p>
-    <w:p>
-      <w:pPr>
-        <w:pStyle w:val="ListBullet"/>
-      </w:pPr>
-      <w:r>
-        <w:t>Compare plaintext and encrypted traffic.</w:t>
-      </w:r>
-    </w:p>
-    <w:p>
-      <w:pPr>
-        <w:pStyle w:val="ListBullet"/>
-      </w:pPr>
-      <w:r>
-        <w:t>Explain the importance of confidentiality in cryptography/security.</w:t>
-      </w:r>
-    </w:p>
+    <w:tbl>
+      <w:tblPr>
+        <w:tblStyle w:val="TableGrid"/>
+        <w:tblW w:type="auto" w:w="0"/>
+        <w:tblLook w:firstColumn="1" w:firstRow="1" w:lastColumn="0" w:lastRow="0" w:noHBand="0" w:noVBand="1" w:val="04A0"/>
+      </w:tblPr>
+      <w:tblGrid>
+        <w:gridCol w:w="4968"/>
+        <w:gridCol w:w="4968"/>
+      </w:tblGrid>
+      <w:tr>
+        <w:tc>
+          <w:tcPr>
+            <w:tcW w:type="dxa" w:w="4968"/>
+          </w:tcPr>
+          <w:p>
+            <w:r>
+              <w:t>AAT Requirement</w:t>
+            </w:r>
+          </w:p>
+        </w:tc>
+        <w:tc>
+          <w:tcPr>
+            <w:tcW w:type="dxa" w:w="4968"/>
+          </w:tcPr>
+          <w:p>
+            <w:r>
+              <w:t>How Our Project Covers It</w:t>
+            </w:r>
+          </w:p>
+        </w:tc>
+      </w:tr>
+      <w:tr>
+        <w:tc>
+          <w:tcPr>
+            <w:tcW w:type="dxa" w:w="4968"/>
+          </w:tcPr>
+          <w:p>
+            <w:r>
+              <w:t>Understanding of tool and usage</w:t>
+            </w:r>
+          </w:p>
+        </w:tc>
+        <w:tc>
+          <w:tcPr>
+            <w:tcW w:type="dxa" w:w="4968"/>
+          </w:tcPr>
+          <w:p>
+            <w:r>
+              <w:t>Explains Netcat, Ncat SSL, ports, sender, receiver, and commands.</w:t>
+            </w:r>
+          </w:p>
+        </w:tc>
+      </w:tr>
+      <w:tr>
+        <w:tc>
+          <w:tcPr>
+            <w:tcW w:type="dxa" w:w="4968"/>
+          </w:tcPr>
+          <w:p>
+            <w:r>
+              <w:t>Practical demonstration</w:t>
+            </w:r>
+          </w:p>
+        </w:tc>
+        <w:tc>
+          <w:tcPr>
+            <w:tcW w:type="dxa" w:w="4968"/>
+          </w:tcPr>
+          <w:p>
+            <w:r>
+              <w:t>Shows plaintext and encrypted file transfer.</w:t>
+            </w:r>
+          </w:p>
+        </w:tc>
+      </w:tr>
+      <w:tr>
+        <w:tc>
+          <w:tcPr>
+            <w:tcW w:type="dxa" w:w="4968"/>
+          </w:tcPr>
+          <w:p>
+            <w:r>
+              <w:t>Cryptanalysis demonstration</w:t>
+            </w:r>
+          </w:p>
+        </w:tc>
+        <w:tc>
+          <w:tcPr>
+            <w:tcW w:type="dxa" w:w="4968"/>
+          </w:tcPr>
+          <w:p>
+            <w:r>
+              <w:t>Uses Wireshark packet sniffing to compare readable and unreadable traffic.</w:t>
+            </w:r>
+          </w:p>
+        </w:tc>
+      </w:tr>
+      <w:tr>
+        <w:tc>
+          <w:tcPr>
+            <w:tcW w:type="dxa" w:w="4968"/>
+          </w:tcPr>
+          <w:p>
+            <w:r>
+              <w:t>Application / relevance</w:t>
+            </w:r>
+          </w:p>
+        </w:tc>
+        <w:tc>
+          <w:tcPr>
+            <w:tcW w:type="dxa" w:w="4968"/>
+          </w:tcPr>
+          <w:p>
+            <w:r>
+              <w:t>Connects the demo to HTTPS, SSH, VPN, and secure file transfer.</w:t>
+            </w:r>
+          </w:p>
+        </w:tc>
+      </w:tr>
+      <w:tr>
+        <w:tc>
+          <w:tcPr>
+            <w:tcW w:type="dxa" w:w="4968"/>
+          </w:tcPr>
+          <w:p>
+            <w:r>
+              <w:t>Report</w:t>
+            </w:r>
+          </w:p>
+        </w:tc>
+        <w:tc>
+          <w:tcPr>
+            <w:tcW w:type="dxa" w:w="4968"/>
+          </w:tcPr>
+          <w:p>
+            <w:r>
+              <w:t>Includes theory, setup, methodology, commands, observations, screenshots, and conclusion.</w:t>
+            </w:r>
+          </w:p>
+        </w:tc>
+      </w:tr>
+      <w:tr>
+        <w:tc>
+          <w:tcPr>
+            <w:tcW w:type="dxa" w:w="4968"/>
+          </w:tcPr>
+          <w:p>
+            <w:r>
+              <w:t>Oral presentation</w:t>
+            </w:r>
+          </w:p>
+        </w:tc>
+        <w:tc>
+          <w:tcPr>
+            <w:tcW w:type="dxa" w:w="4968"/>
+          </w:tcPr>
+          <w:p>
+            <w:r>
+              <w:t>PPT, speaking script, and viva Q&amp;A are prepared.</w:t>
+            </w:r>
+          </w:p>
+        </w:tc>
+      </w:tr>
+    </w:tbl>
     <w:p>
       <w:pPr>
         <w:pStyle w:val="Heading1"/>
       </w:pPr>
       <w:r>
-        <w:t>3. Installation and Setup</w:t>
+        <w:t>5. Tools and Setup</w:t>
       </w:r>
     </w:p>
     <w:tbl>
@@ -219,7 +363,7 @@
           </w:tcPr>
           <w:p>
             <w:r>
-              <w:t>Netcat / Ncat</w:t>
+              <w:t>Netcat (nc)</w:t>
             </w:r>
           </w:p>
         </w:tc>
@@ -229,7 +373,29 @@
           </w:tcPr>
           <w:p>
             <w:r>
-              <w:t>Send data between sender and receiver</w:t>
+              <w:t>Creates plaintext sender and receiver connection.</w:t>
+            </w:r>
+          </w:p>
+        </w:tc>
+      </w:tr>
+      <w:tr>
+        <w:tc>
+          <w:tcPr>
+            <w:tcW w:type="dxa" w:w="4968"/>
+          </w:tcPr>
+          <w:p>
+            <w:r>
+              <w:t>Ncat (ncat --ssl)</w:t>
+            </w:r>
+          </w:p>
+        </w:tc>
+        <w:tc>
+          <w:tcPr>
+            <w:tcW w:type="dxa" w:w="4968"/>
+          </w:tcPr>
+          <w:p>
+            <w:r>
+              <w:t>Creates encrypted Netcat-compatible connection.</w:t>
             </w:r>
           </w:p>
         </w:tc>
@@ -251,7 +417,7 @@
           </w:tcPr>
           <w:p>
             <w:r>
-              <w:t>Capture and inspect packets</w:t>
+              <w:t>Captures and analyzes packets.</w:t>
             </w:r>
           </w:p>
         </w:tc>
@@ -273,7 +439,7 @@
           </w:tcPr>
           <w:p>
             <w:r>
-              <w:t>Generate a temporary SSL certificate</w:t>
+              <w:t>Generates a temporary SSL certificate and key.</w:t>
             </w:r>
           </w:p>
         </w:tc>
@@ -295,7 +461,7 @@
           </w:tcPr>
           <w:p>
             <w:r>
-              <w:t>Run sender and receiver commands</w:t>
+              <w:t>One terminal acts as receiver and one terminal acts as sender.</w:t>
             </w:r>
           </w:p>
         </w:tc>
@@ -303,9 +469,6 @@
     </w:tbl>
     <w:p>
       <w:r>
-        <w:rPr>
-          <w:b w:val="0"/>
-        </w:rPr>
         <w:t>Ubuntu/Linux installation command:</w:t>
       </w:r>
     </w:p>
@@ -328,35 +491,8 @@
       </w:r>
     </w:p>
     <w:p>
-      <w:pPr>
-        <w:pStyle w:val="Heading1"/>
-      </w:pPr>
       <w:r>
-        <w:t>4. Basic Theory</w:t>
-      </w:r>
-    </w:p>
-    <w:p>
-      <w:r>
-        <w:rPr>
-          <w:b w:val="0"/>
-        </w:rPr>
-        <w:t>Plaintext means readable data. Ciphertext means encrypted unreadable data.</w:t>
-      </w:r>
-    </w:p>
-    <w:p>
-      <w:r>
-        <w:rPr>
-          <w:b w:val="0"/>
-        </w:rPr>
-        <w:t>Confidentiality means only authorized users should be able to read the data. Encryption is used to achieve confidentiality.</w:t>
-      </w:r>
-    </w:p>
-    <w:p>
-      <w:r>
-        <w:rPr>
-          <w:b w:val="0"/>
-        </w:rPr>
-        <w:t>In this project, confidentiality is tested by capturing both channels in Wireshark and checking whether the secret message is visible.</w:t>
+        <w:t>Recommended beginner setup: one laptop with two terminals and Wireshark. Use 127.0.0.1 as the receiver IP address. If loopback capture is difficult on Windows, use two laptops on the same Wi-Fi network.</w:t>
       </w:r>
     </w:p>
     <w:p>
@@ -364,7 +500,7 @@
         <w:pStyle w:val="Heading1"/>
       </w:pPr>
       <w:r>
-        <w:t>5. Mini Project Architecture</w:t>
+        <w:t>6. Basic Theory</w:t>
       </w:r>
     </w:p>
     <w:p>
@@ -372,7 +508,7 @@
         <w:pStyle w:val="ListBullet"/>
       </w:pPr>
       <w:r>
-        <w:t>Sender: sends a secret message or file.</w:t>
+        <w:t>Plaintext: readable data before encryption.</w:t>
       </w:r>
     </w:p>
     <w:p>
@@ -380,7 +516,7 @@
         <w:pStyle w:val="ListBullet"/>
       </w:pPr>
       <w:r>
-        <w:t>Receiver: receives the message or file.</w:t>
+        <w:t>Ciphertext: encrypted unreadable data.</w:t>
       </w:r>
     </w:p>
     <w:p>
@@ -388,22 +524,61 @@
         <w:pStyle w:val="ListBullet"/>
       </w:pPr>
       <w:r>
-        <w:t>Attacker/Observer: uses Wireshark to capture packets.</w:t>
+        <w:t>Confidentiality: only authorized users should be able to read the data.</w:t>
+      </w:r>
+    </w:p>
+    <w:p>
+      <w:pPr>
+        <w:pStyle w:val="ListBullet"/>
+      </w:pPr>
+      <w:r>
+        <w:t>Encryption: converts plaintext into ciphertext so captured packets do not reveal the original message.</w:t>
       </w:r>
     </w:p>
     <w:p>
       <w:r>
-        <w:rPr>
-          <w:b w:val="0"/>
-        </w:rPr>
+        <w:t>Normal Netcat sends data as plaintext. Ncat SSL encrypts the channel using SSL/TLS, so Wireshark sees network packets but not the original readable message.</w:t>
+      </w:r>
+    </w:p>
+    <w:p>
+      <w:pPr>
+        <w:pStyle w:val="Heading1"/>
+      </w:pPr>
+      <w:r>
+        <w:t>7. Project Architecture</w:t>
+      </w:r>
+    </w:p>
+    <w:p>
+      <w:pPr>
+        <w:pStyle w:val="ListBullet"/>
+      </w:pPr>
+      <w:r>
+        <w:t>Sender: sends a secret file.</w:t>
+      </w:r>
+    </w:p>
+    <w:p>
+      <w:pPr>
+        <w:pStyle w:val="ListBullet"/>
+      </w:pPr>
+      <w:r>
+        <w:t>Receiver: receives the file.</w:t>
+      </w:r>
+    </w:p>
+    <w:p>
+      <w:pPr>
+        <w:pStyle w:val="ListBullet"/>
+      </w:pPr>
+      <w:r>
+        <w:t>Observer/attacker: captures traffic in Wireshark.</w:t>
+      </w:r>
+    </w:p>
+    <w:p>
+      <w:r>
         <w:t>Plaintext flow: Sender -&gt; Netcat plaintext channel -&gt; Receiver. Wireshark can read the message.</w:t>
       </w:r>
     </w:p>
     <w:p>
       <w:r>
-        <w:rPr>
-          <w:b w:val="0"/>
-        </w:rPr>
         <w:t>Encrypted flow: Sender -&gt; Ncat SSL encrypted channel -&gt; Receiver. Wireshark cannot read the message.</w:t>
       </w:r>
     </w:p>
@@ -412,15 +587,7 @@
         <w:pStyle w:val="Heading1"/>
       </w:pPr>
       <w:r>
-        <w:t>6. Practical Demonstration</w:t>
-      </w:r>
-    </w:p>
-    <w:p>
-      <w:r>
-        <w:rPr>
-          <w:b w:val="0"/>
-        </w:rPr>
-        <w:t>Create the secret file:</w:t>
+        <w:t>8. Practical Demonstration: Secret File</w:t>
       </w:r>
     </w:p>
     <w:p>
@@ -446,15 +613,17 @@
         <w:pStyle w:val="Heading1"/>
       </w:pPr>
       <w:r>
-        <w:t>7. Experiment 1: Plaintext Netcat</w:t>
+        <w:t>9. Experiment 1: Plaintext Netcat Channel</w:t>
       </w:r>
     </w:p>
     <w:p>
       <w:r>
-        <w:rPr>
-          <w:b w:val="0"/>
-        </w:rPr>
-        <w:t>Receiver command:</w:t>
+        <w:t>Start Wireshark and use display filter: tcp.port == 4444</w:t>
+      </w:r>
+    </w:p>
+    <w:p>
+      <w:r>
+        <w:t>Receiver terminal:</w:t>
       </w:r>
     </w:p>
     <w:p>
@@ -468,10 +637,7 @@
     </w:p>
     <w:p>
       <w:r>
-        <w:rPr>
-          <w:b w:val="0"/>
-        </w:rPr>
-        <w:t>Sender command:</w:t>
+        <w:t>Sender terminal:</w:t>
       </w:r>
     </w:p>
     <w:p>
@@ -485,10 +651,7 @@
     </w:p>
     <w:p>
       <w:r>
-        <w:rPr>
-          <w:b w:val="0"/>
-        </w:rPr>
-        <w:t>In Wireshark, use filter tcp.port == 4444, then Follow TCP Stream. The secret message is visible.</w:t>
+        <w:t>Observation: In Wireshark, Follow TCP Stream shows the secret message in readable form. This proves confidentiality is broken.</w:t>
       </w:r>
     </w:p>
     <w:p>
@@ -496,15 +659,12 @@
         <w:pStyle w:val="Heading1"/>
       </w:pPr>
       <w:r>
-        <w:t>8. Cryptanalysis Demonstration</w:t>
+        <w:t>10. Cryptanalysis Demonstration</w:t>
       </w:r>
     </w:p>
     <w:p>
       <w:r>
-        <w:rPr>
-          <w:b w:val="0"/>
-        </w:rPr>
-        <w:t>Here, cryptanalysis is shown as packet sniffing. In plaintext mode there is no encryption to break. The attacker captures packets using Wireshark and directly reads the message. This shows that confidentiality is broken.</w:t>
+        <w:t>In this project, cryptanalysis is shown through packet sniffing. In the plaintext channel, there is no encryption to break. The observer simply captures packets in Wireshark, follows the TCP stream, and reads the message.</w:t>
       </w:r>
     </w:p>
     <w:p>
@@ -512,15 +672,12 @@
         <w:pStyle w:val="Heading1"/>
       </w:pPr>
       <w:r>
-        <w:t>9. Experiment 2: Encrypted Ncat SSL</w:t>
+        <w:t>11. Experiment 2: Encrypted Ncat SSL Channel</w:t>
       </w:r>
     </w:p>
     <w:p>
       <w:r>
-        <w:rPr>
-          <w:b w:val="0"/>
-        </w:rPr>
-        <w:t>Generate temporary certificate:</w:t>
+        <w:t>Generate temporary SSL certificate:</w:t>
       </w:r>
     </w:p>
     <w:p>
@@ -534,10 +691,12 @@
     </w:p>
     <w:p>
       <w:r>
-        <w:rPr>
-          <w:b w:val="0"/>
-        </w:rPr>
-        <w:t>Encrypted receiver command:</w:t>
+        <w:t>Start Wireshark and use display filter: tcp.port == 4445</w:t>
+      </w:r>
+    </w:p>
+    <w:p>
+      <w:r>
+        <w:t>Encrypted receiver terminal:</w:t>
       </w:r>
     </w:p>
     <w:p>
@@ -551,10 +710,7 @@
     </w:p>
     <w:p>
       <w:r>
-        <w:rPr>
-          <w:b w:val="0"/>
-        </w:rPr>
-        <w:t>Encrypted sender command:</w:t>
+        <w:t>Encrypted sender terminal:</w:t>
       </w:r>
     </w:p>
     <w:p>
@@ -568,10 +724,7 @@
     </w:p>
     <w:p>
       <w:r>
-        <w:rPr>
-          <w:b w:val="0"/>
-        </w:rPr>
-        <w:t>In Wireshark, use filter tcp.port == 4445, then Follow TCP Stream. The original message is not visible.</w:t>
+        <w:t>Observation: The receiver gets the correct message, but Wireshark does not show the readable secret text. The traffic appears encrypted.</w:t>
       </w:r>
     </w:p>
     <w:p>
@@ -579,7 +732,7 @@
         <w:pStyle w:val="Heading1"/>
       </w:pPr>
       <w:r>
-        <w:t>10. Observation and Comparison</w:t>
+        <w:t>12. Results and Comparison</w:t>
       </w:r>
     </w:p>
     <w:tbl>
@@ -632,7 +785,39 @@
           </w:tcPr>
           <w:p>
             <w:r>
-              <w:t>Command</w:t>
+              <w:t>Port used</w:t>
+            </w:r>
+          </w:p>
+        </w:tc>
+        <w:tc>
+          <w:tcPr>
+            <w:tcW w:type="dxa" w:w="3312"/>
+          </w:tcPr>
+          <w:p>
+            <w:r>
+              <w:t>4444</w:t>
+            </w:r>
+          </w:p>
+        </w:tc>
+        <w:tc>
+          <w:tcPr>
+            <w:tcW w:type="dxa" w:w="3312"/>
+          </w:tcPr>
+          <w:p>
+            <w:r>
+              <w:t>4445</w:t>
+            </w:r>
+          </w:p>
+        </w:tc>
+      </w:tr>
+      <w:tr>
+        <w:tc>
+          <w:tcPr>
+            <w:tcW w:type="dxa" w:w="3312"/>
+          </w:tcPr>
+          <w:p>
+            <w:r>
+              <w:t>Tool command</w:t>
             </w:r>
           </w:p>
         </w:tc>
@@ -664,7 +849,7 @@
           </w:tcPr>
           <w:p>
             <w:r>
-              <w:t>Port</w:t>
+              <w:t>Receiver gets message</w:t>
             </w:r>
           </w:p>
         </w:tc>
@@ -674,7 +859,7 @@
           </w:tcPr>
           <w:p>
             <w:r>
-              <w:t>4444</w:t>
+              <w:t>Yes</w:t>
             </w:r>
           </w:p>
         </w:tc>
@@ -684,7 +869,7 @@
           </w:tcPr>
           <w:p>
             <w:r>
-              <w:t>4445</w:t>
+              <w:t>Yes</w:t>
             </w:r>
           </w:p>
         </w:tc>
@@ -696,7 +881,7 @@
           </w:tcPr>
           <w:p>
             <w:r>
-              <w:t>Visible in Wireshark</w:t>
+              <w:t>Wireshark can read message</w:t>
             </w:r>
           </w:p>
         </w:tc>
@@ -738,7 +923,7 @@
           </w:tcPr>
           <w:p>
             <w:r>
-              <w:t>Not provided</w:t>
+              <w:t>Not protected</w:t>
             </w:r>
           </w:p>
         </w:tc>
@@ -748,7 +933,7 @@
           </w:tcPr>
           <w:p>
             <w:r>
-              <w:t>Provided</w:t>
+              <w:t>Protected</w:t>
             </w:r>
           </w:p>
         </w:tc>
@@ -760,7 +945,7 @@
           </w:tcPr>
           <w:p>
             <w:r>
-              <w:t>Attacker can read message</w:t>
+              <w:t>Attacker effort</w:t>
             </w:r>
           </w:p>
         </w:tc>
@@ -770,7 +955,7 @@
           </w:tcPr>
           <w:p>
             <w:r>
-              <w:t>Yes</w:t>
+              <w:t>Very easy</w:t>
             </w:r>
           </w:p>
         </w:tc>
@@ -780,7 +965,7 @@
           </w:tcPr>
           <w:p>
             <w:r>
-              <w:t>No</w:t>
+              <w:t>Cannot read without decryption key</w:t>
             </w:r>
           </w:p>
         </w:tc>
@@ -812,7 +997,7 @@
           </w:tcPr>
           <w:p>
             <w:r>
-              <w:t>Better than plaintext</w:t>
+              <w:t>Better for secure-channel demonstration</w:t>
             </w:r>
           </w:p>
         </w:tc>
@@ -823,47 +1008,12 @@
         <w:pStyle w:val="Heading1"/>
       </w:pPr>
       <w:r>
-        <w:t>11. Application and Relevance</w:t>
+        <w:t>13. Application and Relevance</w:t>
       </w:r>
     </w:p>
     <w:p>
-      <w:pPr>
-        <w:pStyle w:val="ListBullet"/>
-      </w:pPr>
       <w:r>
-        <w:t>HTTPS protects website communication.</w:t>
-      </w:r>
-    </w:p>
-    <w:p>
-      <w:pPr>
-        <w:pStyle w:val="ListBullet"/>
-      </w:pPr>
-      <w:r>
-        <w:t>SSH protects remote login sessions.</w:t>
-      </w:r>
-    </w:p>
-    <w:p>
-      <w:pPr>
-        <w:pStyle w:val="ListBullet"/>
-      </w:pPr>
-      <w:r>
-        <w:t>VPNs protect network traffic on unsafe networks.</w:t>
-      </w:r>
-    </w:p>
-    <w:p>
-      <w:pPr>
-        <w:pStyle w:val="ListBullet"/>
-      </w:pPr>
-      <w:r>
-        <w:t>Secure file transfer tools protect files during transmission.</w:t>
-      </w:r>
-    </w:p>
-    <w:p>
-      <w:pPr>
-        <w:pStyle w:val="ListBullet"/>
-      </w:pPr>
-      <w:r>
-        <w:t>Encrypted messaging applications protect private chats.</w:t>
+        <w:t>This project relates directly to real-world security. HTTPS encrypts website traffic, SSH encrypts remote login, VPNs encrypt network traffic on unsafe networks, and secure file transfer tools encrypt files during transmission. The same basic idea is demonstrated here: readable plaintext is unsafe, while encrypted data protects confidentiality.</w:t>
       </w:r>
     </w:p>
     <w:p>
@@ -871,7 +1021,7 @@
         <w:pStyle w:val="Heading1"/>
       </w:pPr>
       <w:r>
-        <w:t>12. Limitations</w:t>
+        <w:t>14. Limitations</w:t>
       </w:r>
     </w:p>
     <w:p>
@@ -887,7 +1037,7 @@
         <w:pStyle w:val="ListBullet"/>
       </w:pPr>
       <w:r>
-        <w:t>Ncat SSL is useful for demonstration, but production systems usually use SSH, SCP, HTTPS, or VPN.</w:t>
+        <w:t>Ncat SSL is used for learning and demonstration, not as a replacement for well-managed production systems.</w:t>
       </w:r>
     </w:p>
     <w:p>
@@ -895,7 +1045,7 @@
         <w:pStyle w:val="ListBullet"/>
       </w:pPr>
       <w:r>
-        <w:t>Self-signed certificates are acceptable for lab demos but not ideal for real public systems.</w:t>
+        <w:t>Self-signed certificates are acceptable for lab demos but not recommended for public production services.</w:t>
       </w:r>
     </w:p>
     <w:p>
@@ -903,7 +1053,7 @@
         <w:pStyle w:val="ListBullet"/>
       </w:pPr>
       <w:r>
-        <w:t>The project focuses mainly on confidentiality.</w:t>
+        <w:t>This project mainly focuses on confidentiality; authentication and integrity can be future improvements.</w:t>
       </w:r>
     </w:p>
     <w:p>
@@ -911,7 +1061,55 @@
         <w:pStyle w:val="Heading1"/>
       </w:pPr>
       <w:r>
-        <w:t>13. Team Contribution</w:t>
+        <w:t>15. Future Scope</w:t>
+      </w:r>
+    </w:p>
+    <w:p>
+      <w:pPr>
+        <w:pStyle w:val="ListBullet"/>
+      </w:pPr>
+      <w:r>
+        <w:t>Add certificate verification.</w:t>
+      </w:r>
+    </w:p>
+    <w:p>
+      <w:pPr>
+        <w:pStyle w:val="ListBullet"/>
+      </w:pPr>
+      <w:r>
+        <w:t>Compare SSH/SCP with Netcat.</w:t>
+      </w:r>
+    </w:p>
+    <w:p>
+      <w:pPr>
+        <w:pStyle w:val="ListBullet"/>
+      </w:pPr>
+      <w:r>
+        <w:t>Transfer larger files and compare performance.</w:t>
+      </w:r>
+    </w:p>
+    <w:p>
+      <w:pPr>
+        <w:pStyle w:val="ListBullet"/>
+      </w:pPr>
+      <w:r>
+        <w:t>Use file hashes before and after transfer to prove integrity.</w:t>
+      </w:r>
+    </w:p>
+    <w:p>
+      <w:pPr>
+        <w:pStyle w:val="ListBullet"/>
+      </w:pPr>
+      <w:r>
+        <w:t>Explain how HTTPS uses TLS in a similar way.</w:t>
+      </w:r>
+    </w:p>
+    <w:p>
+      <w:pPr>
+        <w:pStyle w:val="Heading1"/>
+      </w:pPr>
+      <w:r>
+        <w:t>16. Team Contribution</w:t>
       </w:r>
     </w:p>
     <w:tbl>
@@ -963,7 +1161,7 @@
           </w:tcPr>
           <w:p>
             <w:r>
-              <w:t>Netcat introduction and plaintext demo</w:t>
+              <w:t>Netcat introduction, setup, plaintext demo.</w:t>
             </w:r>
           </w:p>
         </w:tc>
@@ -985,7 +1183,7 @@
           </w:tcPr>
           <w:p>
             <w:r>
-              <w:t>Confidentiality concept and encrypted Ncat SSL demo</w:t>
+              <w:t>Confidentiality theory, encryption explanation, Ncat SSL demo.</w:t>
             </w:r>
           </w:p>
         </w:tc>
@@ -1007,7 +1205,7 @@
           </w:tcPr>
           <w:p>
             <w:r>
-              <w:t>Wireshark observation, comparison, and conclusion</w:t>
+              <w:t>Wireshark analysis, comparison table, report/PPT conclusion.</w:t>
             </w:r>
           </w:p>
         </w:tc>
@@ -1018,15 +1216,12 @@
         <w:pStyle w:val="Heading1"/>
       </w:pPr>
       <w:r>
-        <w:t>14. Conclusion</w:t>
+        <w:t>17. Conclusion</w:t>
       </w:r>
     </w:p>
     <w:p>
       <w:r>
-        <w:rPr>
-          <w:b w:val="0"/>
-        </w:rPr>
-        <w:t>The project successfully demonstrates secure data transmission over a Netcat-style tool. Normal Netcat sends data as plaintext, and the secret message is visible in Wireshark. Ncat SSL encrypts the channel, so the same message reaches the receiver but is not readable in packet capture. Therefore, encrypted channels protect confidentiality during transmission.</w:t>
+        <w:t>The project successfully demonstrates the importance of encryption in secure data transmission. Normal Netcat sends the message as plaintext, and Wireshark can read it easily. Ncat SSL sends the same message through an encrypted channel, so Wireshark cannot show the readable message. Therefore, encrypted channels protect confidentiality and are necessary when sensitive data is transmitted over a network.</w:t>
       </w:r>
     </w:p>
     <w:p>
@@ -1034,15 +1229,7 @@
         <w:pStyle w:val="Heading1"/>
       </w:pPr>
       <w:r>
-        <w:t>15. References</w:t>
-      </w:r>
-    </w:p>
-    <w:p>
-      <w:pPr>
-        <w:pStyle w:val="ListBullet"/>
-      </w:pPr>
-      <w:r>
-        <w:t>Netcat manual pages</w:t>
+        <w:t>References</w:t>
       </w:r>
     </w:p>
     <w:p>
@@ -1071,10 +1258,18 @@
     </w:p>
     <w:p>
       <w:pPr>
+        <w:pStyle w:val="ListBullet"/>
+      </w:pPr>
+      <w:r>
+        <w:t>Netcat manual pages</w:t>
+      </w:r>
+    </w:p>
+    <w:p>
+      <w:pPr>
         <w:pStyle w:val="Heading1"/>
       </w:pPr>
       <w:r>
-        <w:t>Appendix: Screenshot Checklist</w:t>
+        <w:t>Screenshot Checklist</w:t>
       </w:r>
     </w:p>
     <w:p>
@@ -1082,7 +1277,7 @@
         <w:pStyle w:val="ListBullet"/>
       </w:pPr>
       <w:r>
-        <w:t>Plaintext receiver command screenshot.</w:t>
+        <w:t>Plaintext receiver command.</w:t>
       </w:r>
     </w:p>
     <w:p>
@@ -1090,7 +1285,7 @@
         <w:pStyle w:val="ListBullet"/>
       </w:pPr>
       <w:r>
-        <w:t>Plaintext sender command screenshot.</w:t>
+        <w:t>Plaintext sender command.</w:t>
       </w:r>
     </w:p>
     <w:p>
@@ -1098,7 +1293,7 @@
         <w:pStyle w:val="ListBullet"/>
       </w:pPr>
       <w:r>
-        <w:t>Wireshark TCP stream showing readable message on port 4444.</w:t>
+        <w:t>Wireshark Follow TCP Stream showing readable message on port 4444.</w:t>
       </w:r>
     </w:p>
     <w:p>
@@ -1106,7 +1301,7 @@
         <w:pStyle w:val="ListBullet"/>
       </w:pPr>
       <w:r>
-        <w:t>Certificate generation screenshot.</w:t>
+        <w:t>OpenSSL certificate generation command.</w:t>
       </w:r>
     </w:p>
     <w:p>
@@ -1114,7 +1309,7 @@
         <w:pStyle w:val="ListBullet"/>
       </w:pPr>
       <w:r>
-        <w:t>Encrypted receiver command screenshot.</w:t>
+        <w:t>Encrypted receiver command.</w:t>
       </w:r>
     </w:p>
     <w:p>
@@ -1122,7 +1317,7 @@
         <w:pStyle w:val="ListBullet"/>
       </w:pPr>
       <w:r>
-        <w:t>Encrypted sender command screenshot.</w:t>
+        <w:t>Encrypted sender command.</w:t>
       </w:r>
     </w:p>
     <w:p>
@@ -1130,7 +1325,7 @@
         <w:pStyle w:val="ListBullet"/>
       </w:pPr>
       <w:r>
-        <w:t>Wireshark TCP stream showing unreadable data on port 4445.</w:t>
+        <w:t>Wireshark Follow TCP Stream showing unreadable encrypted data on port 4445.</w:t>
       </w:r>
     </w:p>
     <w:sectPr>

</xml_diff>